<commit_message>
Done print preview docx ranap dewasa
</commit_message>
<xml_diff>
--- a/public/doc/emr/print_ranap_dewasa_dokter.docx
+++ b/public/doc/emr/print_ranap_dewasa_dokter.docx
@@ -1,6 +1,6 @@
 
 <file path=word/document.xml><?xml version="1.0" encoding="utf-8"?>
-<w:document xmlns:wpc="http://schemas.microsoft.com/office/word/2010/wordprocessingCanvas" xmlns:cx="http://schemas.microsoft.com/office/drawing/2014/chartex" xmlns:cx1="http://schemas.microsoft.com/office/drawing/2015/9/8/chartex" xmlns:cx2="http://schemas.microsoft.com/office/drawing/2015/10/21/chartex" xmlns:cx3="http://schemas.microsoft.com/office/drawing/2016/5/9/chartex" xmlns:cx4="http://schemas.microsoft.com/office/drawing/2016/5/10/chartex" xmlns:cx5="http://schemas.microsoft.com/office/drawing/2016/5/11/chartex" xmlns:cx6="http://schemas.microsoft.com/office/drawing/2016/5/12/chartex" xmlns:cx7="http://schemas.microsoft.com/office/drawing/2016/5/13/chartex" xmlns:cx8="http://schemas.microsoft.com/office/drawing/2016/5/14/chartex" xmlns:mc="http://schemas.openxmlformats.org/markup-compatibility/2006" xmlns:aink="http://schemas.microsoft.com/office/drawing/2016/ink" xmlns:am3d="http://schemas.microsoft.com/office/drawing/2017/model3d" xmlns:o="urn:schemas-microsoft-com:office:office" xmlns:oel="http://schemas.microsoft.com/office/2019/extlst" xmlns:r="http://schemas.openxmlformats.org/officeDocument/2006/relationships" xmlns:m="http://schemas.openxmlformats.org/officeDocument/2006/math" xmlns:v="urn:schemas-microsoft-com:vml" xmlns:wp14="http://schemas.microsoft.com/office/word/2010/wordprocessingDrawing" xmlns:wp="http://schemas.openxmlformats.org/drawingml/2006/wordprocessingDrawing" xmlns:w10="urn:schemas-microsoft-com:office:word" xmlns:w="http://schemas.openxmlformats.org/wordprocessingml/2006/main" xmlns:w14="http://schemas.microsoft.com/office/word/2010/wordml" xmlns:w15="http://schemas.microsoft.com/office/word/2012/wordml" xmlns:w16cex="http://schemas.microsoft.com/office/word/2018/wordml/cex" xmlns:w16cid="http://schemas.microsoft.com/office/word/2016/wordml/cid" xmlns:w16="http://schemas.microsoft.com/office/word/2018/wordml" xmlns:w16sdtdh="http://schemas.microsoft.com/office/word/2020/wordml/sdtdatahash" xmlns:w16se="http://schemas.microsoft.com/office/word/2015/wordml/symex" xmlns:wpg="http://schemas.microsoft.com/office/word/2010/wordprocessingGroup" xmlns:wpi="http://schemas.microsoft.com/office/word/2010/wordprocessingInk" xmlns:wne="http://schemas.microsoft.com/office/word/2006/wordml" xmlns:wps="http://schemas.microsoft.com/office/word/2010/wordprocessingShape" mc:Ignorable="w14 w15 w16se w16cid w16 w16cex w16sdtdh wp14">
+<w:document xmlns:wpc="http://schemas.microsoft.com/office/word/2010/wordprocessingCanvas" xmlns:cx="http://schemas.microsoft.com/office/drawing/2014/chartex" xmlns:cx1="http://schemas.microsoft.com/office/drawing/2015/9/8/chartex" xmlns:cx2="http://schemas.microsoft.com/office/drawing/2015/10/21/chartex" xmlns:cx3="http://schemas.microsoft.com/office/drawing/2016/5/9/chartex" xmlns:cx4="http://schemas.microsoft.com/office/drawing/2016/5/10/chartex" xmlns:cx5="http://schemas.microsoft.com/office/drawing/2016/5/11/chartex" xmlns:cx6="http://schemas.microsoft.com/office/drawing/2016/5/12/chartex" xmlns:cx7="http://schemas.microsoft.com/office/drawing/2016/5/13/chartex" xmlns:cx8="http://schemas.microsoft.com/office/drawing/2016/5/14/chartex" xmlns:mc="http://schemas.openxmlformats.org/markup-compatibility/2006" xmlns:aink="http://schemas.microsoft.com/office/drawing/2016/ink" xmlns:am3d="http://schemas.microsoft.com/office/drawing/2017/model3d" xmlns:o="urn:schemas-microsoft-com:office:office" xmlns:oel="http://schemas.microsoft.com/office/2019/extlst" xmlns:r="http://schemas.openxmlformats.org/officeDocument/2006/relationships" xmlns:m="http://schemas.openxmlformats.org/officeDocument/2006/math" xmlns:v="urn:schemas-microsoft-com:vml" xmlns:wp14="http://schemas.microsoft.com/office/word/2010/wordprocessingDrawing" xmlns:wp="http://schemas.openxmlformats.org/drawingml/2006/wordprocessingDrawing" xmlns:w10="urn:schemas-microsoft-com:office:word" xmlns:w="http://schemas.openxmlformats.org/wordprocessingml/2006/main" xmlns:w14="http://schemas.microsoft.com/office/word/2010/wordml" xmlns:w15="http://schemas.microsoft.com/office/word/2012/wordml" xmlns:w16cex="http://schemas.microsoft.com/office/word/2018/wordml/cex" xmlns:w16cid="http://schemas.microsoft.com/office/word/2016/wordml/cid" xmlns:w16="http://schemas.microsoft.com/office/word/2018/wordml" xmlns:w16du="http://schemas.microsoft.com/office/word/2023/wordml/word16du" xmlns:w16sdtdh="http://schemas.microsoft.com/office/word/2020/wordml/sdtdatahash" xmlns:w16sdtfl="http://schemas.microsoft.com/office/word/2024/wordml/sdtformatlock" xmlns:w16se="http://schemas.microsoft.com/office/word/2015/wordml/symex" xmlns:wpg="http://schemas.microsoft.com/office/word/2010/wordprocessingGroup" xmlns:wpi="http://schemas.microsoft.com/office/word/2010/wordprocessingInk" xmlns:wne="http://schemas.microsoft.com/office/word/2006/wordml" xmlns:wps="http://schemas.microsoft.com/office/word/2010/wordprocessingShape" mc:Ignorable="w14 w15 w16se w16cid w16 w16cex w16sdtdh w16sdtfl w16du wp14">
   <w:body>
     <w:tbl>
       <w:tblPr>
@@ -144,23 +144,7 @@
                 <w:b/>
                 <w:szCs w:val="16"/>
               </w:rPr>
-              <w:t xml:space="preserve">Jl. Mayor Sunaryo No.37, </w:t>
-            </w:r>
-            <w:proofErr w:type="spellStart"/>
-            <w:r>
-              <w:rPr>
-                <w:b/>
-                <w:szCs w:val="16"/>
-              </w:rPr>
-              <w:t>Jetis</w:t>
-            </w:r>
-            <w:proofErr w:type="spellEnd"/>
-            <w:r>
-              <w:rPr>
-                <w:b/>
-                <w:szCs w:val="16"/>
-              </w:rPr>
-              <w:t xml:space="preserve">, </w:t>
+              <w:t xml:space="preserve">Jl. Mayor Sunaryo No.37, Jetis, </w:t>
             </w:r>
             <w:proofErr w:type="spellStart"/>
             <w:r>
@@ -218,7 +202,23 @@
                 <w:b/>
                 <w:szCs w:val="16"/>
               </w:rPr>
-              <w:t xml:space="preserve"> Website : </w:t>
+              <w:t xml:space="preserve"> </w:t>
+            </w:r>
+            <w:proofErr w:type="gramStart"/>
+            <w:r>
+              <w:rPr>
+                <w:b/>
+                <w:szCs w:val="16"/>
+              </w:rPr>
+              <w:t>Website :</w:t>
+            </w:r>
+            <w:proofErr w:type="gramEnd"/>
+            <w:r>
+              <w:rPr>
+                <w:b/>
+                <w:szCs w:val="16"/>
+              </w:rPr>
+              <w:t xml:space="preserve"> </w:t>
             </w:r>
             <w:hyperlink r:id="rId10" w:history="1">
               <w:r>
@@ -592,7 +592,17 @@
                 <w:sz w:val="26"/>
                 <w:szCs w:val="26"/>
               </w:rPr>
-              <w:t>RM 3 e 1</w:t>
+              <w:t xml:space="preserve">RM </w:t>
+            </w:r>
+            <w:r>
+              <w:rPr>
+                <w:b/>
+                <w:bCs/>
+                <w:noProof/>
+                <w:sz w:val="26"/>
+                <w:szCs w:val="26"/>
+              </w:rPr>
+              <w:t>03 f</w:t>
             </w:r>
           </w:p>
         </w:tc>
@@ -1088,13 +1098,8 @@
             </w:r>
             <w:proofErr w:type="spellEnd"/>
             <w:r>
-              <w:t xml:space="preserve"> </w:t>
-            </w:r>
-            <w:proofErr w:type="spellStart"/>
-            <w:r>
-              <w:t>Umum</w:t>
-            </w:r>
-            <w:proofErr w:type="spellEnd"/>
+              <w:t xml:space="preserve"> Umum</w:t>
+            </w:r>
           </w:p>
         </w:tc>
         <w:tc>
@@ -1320,13 +1325,8 @@
             </w:r>
             <w:proofErr w:type="spellEnd"/>
             <w:r>
-              <w:t xml:space="preserve"> </w:t>
-            </w:r>
-            <w:proofErr w:type="spellStart"/>
-            <w:r>
-              <w:t>Nafas</w:t>
-            </w:r>
-            <w:proofErr w:type="spellEnd"/>
+              <w:t xml:space="preserve"> Nafas</w:t>
+            </w:r>
           </w:p>
         </w:tc>
         <w:tc>
@@ -1733,13 +1733,8 @@
             <w:gridSpan w:val="3"/>
           </w:tcPr>
           <w:p>
-            <w:proofErr w:type="spellStart"/>
-            <w:r>
-              <w:t>Paru</w:t>
-            </w:r>
-            <w:proofErr w:type="spellEnd"/>
-            <w:r>
-              <w:t xml:space="preserve"> (</w:t>
+            <w:r>
+              <w:t>Paru (</w:t>
             </w:r>
             <w:proofErr w:type="spellStart"/>
             <w:r>
@@ -2323,7 +2318,14 @@
             </w:r>
             <w:r>
               <w:br/>
-              <w:t xml:space="preserve">Alasan : </w:t>
+            </w:r>
+            <w:proofErr w:type="gramStart"/>
+            <w:r>
+              <w:t>Alasan :</w:t>
+            </w:r>
+            <w:proofErr w:type="gramEnd"/>
+            <w:r>
+              <w:t xml:space="preserve"> </w:t>
             </w:r>
             <w:r>
               <w:t>${KRITERIA_PULANG_KARENA}</w:t>
@@ -2582,6 +2584,7 @@
               </w:rPr>
               <w:t>FINALISASI_OLEH</w:t>
             </w:r>
+            <w:proofErr w:type="gramStart"/>
             <w:r>
               <w:rPr>
                 <w:u w:val="single"/>
@@ -2591,6 +2594,7 @@
             <w:r>
               <w:t xml:space="preserve"> )</w:t>
             </w:r>
+            <w:proofErr w:type="gramEnd"/>
           </w:p>
           <w:p>
             <w:pPr>
@@ -2606,25 +2610,7 @@
                 <w:szCs w:val="18"/>
                 <w:lang w:val="en-ID"/>
               </w:rPr>
-              <w:t xml:space="preserve">Tanda </w:t>
-            </w:r>
-            <w:proofErr w:type="spellStart"/>
-            <w:r>
-              <w:rPr>
-                <w:sz w:val="14"/>
-                <w:szCs w:val="18"/>
-                <w:lang w:val="en-ID"/>
-              </w:rPr>
-              <w:t>Tangan</w:t>
-            </w:r>
-            <w:proofErr w:type="spellEnd"/>
-            <w:r>
-              <w:rPr>
-                <w:sz w:val="14"/>
-                <w:szCs w:val="18"/>
-                <w:lang w:val="en-ID"/>
-              </w:rPr>
-              <w:t xml:space="preserve"> dan Nama </w:t>
+              <w:t xml:space="preserve">Tanda Tangan dan Nama </w:t>
             </w:r>
             <w:proofErr w:type="spellStart"/>
             <w:r>
@@ -2657,7 +2643,7 @@
 </file>
 
 <file path=word/endnotes.xml><?xml version="1.0" encoding="utf-8"?>
-<w:endnotes xmlns:wpc="http://schemas.microsoft.com/office/word/2010/wordprocessingCanvas" xmlns:cx="http://schemas.microsoft.com/office/drawing/2014/chartex" xmlns:cx1="http://schemas.microsoft.com/office/drawing/2015/9/8/chartex" xmlns:cx2="http://schemas.microsoft.com/office/drawing/2015/10/21/chartex" xmlns:cx3="http://schemas.microsoft.com/office/drawing/2016/5/9/chartex" xmlns:cx4="http://schemas.microsoft.com/office/drawing/2016/5/10/chartex" xmlns:cx5="http://schemas.microsoft.com/office/drawing/2016/5/11/chartex" xmlns:cx6="http://schemas.microsoft.com/office/drawing/2016/5/12/chartex" xmlns:cx7="http://schemas.microsoft.com/office/drawing/2016/5/13/chartex" xmlns:cx8="http://schemas.microsoft.com/office/drawing/2016/5/14/chartex" xmlns:mc="http://schemas.openxmlformats.org/markup-compatibility/2006" xmlns:aink="http://schemas.microsoft.com/office/drawing/2016/ink" xmlns:am3d="http://schemas.microsoft.com/office/drawing/2017/model3d" xmlns:o="urn:schemas-microsoft-com:office:office" xmlns:oel="http://schemas.microsoft.com/office/2019/extlst" xmlns:r="http://schemas.openxmlformats.org/officeDocument/2006/relationships" xmlns:m="http://schemas.openxmlformats.org/officeDocument/2006/math" xmlns:v="urn:schemas-microsoft-com:vml" xmlns:wp14="http://schemas.microsoft.com/office/word/2010/wordprocessingDrawing" xmlns:wp="http://schemas.openxmlformats.org/drawingml/2006/wordprocessingDrawing" xmlns:w10="urn:schemas-microsoft-com:office:word" xmlns:w="http://schemas.openxmlformats.org/wordprocessingml/2006/main" xmlns:w14="http://schemas.microsoft.com/office/word/2010/wordml" xmlns:w15="http://schemas.microsoft.com/office/word/2012/wordml" xmlns:w16cex="http://schemas.microsoft.com/office/word/2018/wordml/cex" xmlns:w16cid="http://schemas.microsoft.com/office/word/2016/wordml/cid" xmlns:w16="http://schemas.microsoft.com/office/word/2018/wordml" xmlns:w16sdtdh="http://schemas.microsoft.com/office/word/2020/wordml/sdtdatahash" xmlns:w16se="http://schemas.microsoft.com/office/word/2015/wordml/symex" xmlns:wpg="http://schemas.microsoft.com/office/word/2010/wordprocessingGroup" xmlns:wpi="http://schemas.microsoft.com/office/word/2010/wordprocessingInk" xmlns:wne="http://schemas.microsoft.com/office/word/2006/wordml" xmlns:wps="http://schemas.microsoft.com/office/word/2010/wordprocessingShape" mc:Ignorable="w14 w15 w16se w16cid w16 w16cex w16sdtdh wp14">
+<w:endnotes xmlns:wpc="http://schemas.microsoft.com/office/word/2010/wordprocessingCanvas" xmlns:cx="http://schemas.microsoft.com/office/drawing/2014/chartex" xmlns:cx1="http://schemas.microsoft.com/office/drawing/2015/9/8/chartex" xmlns:cx2="http://schemas.microsoft.com/office/drawing/2015/10/21/chartex" xmlns:cx3="http://schemas.microsoft.com/office/drawing/2016/5/9/chartex" xmlns:cx4="http://schemas.microsoft.com/office/drawing/2016/5/10/chartex" xmlns:cx5="http://schemas.microsoft.com/office/drawing/2016/5/11/chartex" xmlns:cx6="http://schemas.microsoft.com/office/drawing/2016/5/12/chartex" xmlns:cx7="http://schemas.microsoft.com/office/drawing/2016/5/13/chartex" xmlns:cx8="http://schemas.microsoft.com/office/drawing/2016/5/14/chartex" xmlns:mc="http://schemas.openxmlformats.org/markup-compatibility/2006" xmlns:aink="http://schemas.microsoft.com/office/drawing/2016/ink" xmlns:am3d="http://schemas.microsoft.com/office/drawing/2017/model3d" xmlns:o="urn:schemas-microsoft-com:office:office" xmlns:oel="http://schemas.microsoft.com/office/2019/extlst" xmlns:r="http://schemas.openxmlformats.org/officeDocument/2006/relationships" xmlns:m="http://schemas.openxmlformats.org/officeDocument/2006/math" xmlns:v="urn:schemas-microsoft-com:vml" xmlns:wp14="http://schemas.microsoft.com/office/word/2010/wordprocessingDrawing" xmlns:wp="http://schemas.openxmlformats.org/drawingml/2006/wordprocessingDrawing" xmlns:w10="urn:schemas-microsoft-com:office:word" xmlns:w="http://schemas.openxmlformats.org/wordprocessingml/2006/main" xmlns:w14="http://schemas.microsoft.com/office/word/2010/wordml" xmlns:w15="http://schemas.microsoft.com/office/word/2012/wordml" xmlns:w16cex="http://schemas.microsoft.com/office/word/2018/wordml/cex" xmlns:w16cid="http://schemas.microsoft.com/office/word/2016/wordml/cid" xmlns:w16="http://schemas.microsoft.com/office/word/2018/wordml" xmlns:w16du="http://schemas.microsoft.com/office/word/2023/wordml/word16du" xmlns:w16sdtdh="http://schemas.microsoft.com/office/word/2020/wordml/sdtdatahash" xmlns:w16sdtfl="http://schemas.microsoft.com/office/word/2024/wordml/sdtformatlock" xmlns:w16se="http://schemas.microsoft.com/office/word/2015/wordml/symex" xmlns:wpg="http://schemas.microsoft.com/office/word/2010/wordprocessingGroup" xmlns:wpi="http://schemas.microsoft.com/office/word/2010/wordprocessingInk" xmlns:wne="http://schemas.microsoft.com/office/word/2006/wordml" xmlns:wps="http://schemas.microsoft.com/office/word/2010/wordprocessingShape" mc:Ignorable="w14 w15 w16se w16cid w16 w16cex w16sdtdh w16sdtfl w16du wp14">
   <w:endnote w:type="separator" w:id="-1">
     <w:p>
       <w:pPr>
@@ -2682,7 +2668,7 @@
 </file>
 
 <file path=word/footer1.xml><?xml version="1.0" encoding="utf-8"?>
-<w:ftr xmlns:wpc="http://schemas.microsoft.com/office/word/2010/wordprocessingCanvas" xmlns:cx="http://schemas.microsoft.com/office/drawing/2014/chartex" xmlns:cx1="http://schemas.microsoft.com/office/drawing/2015/9/8/chartex" xmlns:cx2="http://schemas.microsoft.com/office/drawing/2015/10/21/chartex" xmlns:cx3="http://schemas.microsoft.com/office/drawing/2016/5/9/chartex" xmlns:cx4="http://schemas.microsoft.com/office/drawing/2016/5/10/chartex" xmlns:cx5="http://schemas.microsoft.com/office/drawing/2016/5/11/chartex" xmlns:cx6="http://schemas.microsoft.com/office/drawing/2016/5/12/chartex" xmlns:cx7="http://schemas.microsoft.com/office/drawing/2016/5/13/chartex" xmlns:cx8="http://schemas.microsoft.com/office/drawing/2016/5/14/chartex" xmlns:mc="http://schemas.openxmlformats.org/markup-compatibility/2006" xmlns:aink="http://schemas.microsoft.com/office/drawing/2016/ink" xmlns:am3d="http://schemas.microsoft.com/office/drawing/2017/model3d" xmlns:o="urn:schemas-microsoft-com:office:office" xmlns:oel="http://schemas.microsoft.com/office/2019/extlst" xmlns:r="http://schemas.openxmlformats.org/officeDocument/2006/relationships" xmlns:m="http://schemas.openxmlformats.org/officeDocument/2006/math" xmlns:v="urn:schemas-microsoft-com:vml" xmlns:wp14="http://schemas.microsoft.com/office/word/2010/wordprocessingDrawing" xmlns:wp="http://schemas.openxmlformats.org/drawingml/2006/wordprocessingDrawing" xmlns:w10="urn:schemas-microsoft-com:office:word" xmlns:w="http://schemas.openxmlformats.org/wordprocessingml/2006/main" xmlns:w14="http://schemas.microsoft.com/office/word/2010/wordml" xmlns:w15="http://schemas.microsoft.com/office/word/2012/wordml" xmlns:w16cex="http://schemas.microsoft.com/office/word/2018/wordml/cex" xmlns:w16cid="http://schemas.microsoft.com/office/word/2016/wordml/cid" xmlns:w16="http://schemas.microsoft.com/office/word/2018/wordml" xmlns:w16sdtdh="http://schemas.microsoft.com/office/word/2020/wordml/sdtdatahash" xmlns:w16se="http://schemas.microsoft.com/office/word/2015/wordml/symex" xmlns:wpg="http://schemas.microsoft.com/office/word/2010/wordprocessingGroup" xmlns:wpi="http://schemas.microsoft.com/office/word/2010/wordprocessingInk" xmlns:wne="http://schemas.microsoft.com/office/word/2006/wordml" xmlns:wps="http://schemas.microsoft.com/office/word/2010/wordprocessingShape" mc:Ignorable="w14 w15 w16se w16cid w16 w16cex w16sdtdh wp14">
+<w:ftr xmlns:wpc="http://schemas.microsoft.com/office/word/2010/wordprocessingCanvas" xmlns:cx="http://schemas.microsoft.com/office/drawing/2014/chartex" xmlns:cx1="http://schemas.microsoft.com/office/drawing/2015/9/8/chartex" xmlns:cx2="http://schemas.microsoft.com/office/drawing/2015/10/21/chartex" xmlns:cx3="http://schemas.microsoft.com/office/drawing/2016/5/9/chartex" xmlns:cx4="http://schemas.microsoft.com/office/drawing/2016/5/10/chartex" xmlns:cx5="http://schemas.microsoft.com/office/drawing/2016/5/11/chartex" xmlns:cx6="http://schemas.microsoft.com/office/drawing/2016/5/12/chartex" xmlns:cx7="http://schemas.microsoft.com/office/drawing/2016/5/13/chartex" xmlns:cx8="http://schemas.microsoft.com/office/drawing/2016/5/14/chartex" xmlns:mc="http://schemas.openxmlformats.org/markup-compatibility/2006" xmlns:aink="http://schemas.microsoft.com/office/drawing/2016/ink" xmlns:am3d="http://schemas.microsoft.com/office/drawing/2017/model3d" xmlns:o="urn:schemas-microsoft-com:office:office" xmlns:oel="http://schemas.microsoft.com/office/2019/extlst" xmlns:r="http://schemas.openxmlformats.org/officeDocument/2006/relationships" xmlns:m="http://schemas.openxmlformats.org/officeDocument/2006/math" xmlns:v="urn:schemas-microsoft-com:vml" xmlns:wp14="http://schemas.microsoft.com/office/word/2010/wordprocessingDrawing" xmlns:wp="http://schemas.openxmlformats.org/drawingml/2006/wordprocessingDrawing" xmlns:w10="urn:schemas-microsoft-com:office:word" xmlns:w="http://schemas.openxmlformats.org/wordprocessingml/2006/main" xmlns:w14="http://schemas.microsoft.com/office/word/2010/wordml" xmlns:w15="http://schemas.microsoft.com/office/word/2012/wordml" xmlns:w16cex="http://schemas.microsoft.com/office/word/2018/wordml/cex" xmlns:w16cid="http://schemas.microsoft.com/office/word/2016/wordml/cid" xmlns:w16="http://schemas.microsoft.com/office/word/2018/wordml" xmlns:w16du="http://schemas.microsoft.com/office/word/2023/wordml/word16du" xmlns:w16sdtdh="http://schemas.microsoft.com/office/word/2020/wordml/sdtdatahash" xmlns:w16sdtfl="http://schemas.microsoft.com/office/word/2024/wordml/sdtformatlock" xmlns:w16se="http://schemas.microsoft.com/office/word/2015/wordml/symex" xmlns:wpg="http://schemas.microsoft.com/office/word/2010/wordprocessingGroup" xmlns:wpi="http://schemas.microsoft.com/office/word/2010/wordprocessingInk" xmlns:wne="http://schemas.microsoft.com/office/word/2006/wordml" xmlns:wps="http://schemas.microsoft.com/office/word/2010/wordprocessingShape" mc:Ignorable="w14 w15 w16se w16cid w16 w16cex w16sdtdh w16sdtfl w16du wp14">
   <w:p>
     <w:pPr>
       <w:pStyle w:val="Footer"/>
@@ -2693,7 +2679,6 @@
         <w:lang w:val="en-ID"/>
       </w:rPr>
     </w:pPr>
-    <w:proofErr w:type="spellStart"/>
     <w:r>
       <w:rPr>
         <w:i/>
@@ -2701,83 +2686,14 @@
         <w:sz w:val="16"/>
         <w:szCs w:val="20"/>
       </w:rPr>
-      <w:t>Formulir</w:t>
-    </w:r>
-    <w:proofErr w:type="spellEnd"/>
-    <w:r>
-      <w:rPr>
-        <w:i/>
-        <w:iCs/>
-        <w:sz w:val="16"/>
-        <w:szCs w:val="20"/>
-      </w:rPr>
-      <w:t xml:space="preserve"> </w:t>
-    </w:r>
-    <w:proofErr w:type="spellStart"/>
-    <w:r>
-      <w:rPr>
-        <w:i/>
-        <w:iCs/>
-        <w:sz w:val="16"/>
-        <w:szCs w:val="20"/>
-      </w:rPr>
-      <w:t>ini</w:t>
-    </w:r>
-    <w:proofErr w:type="spellEnd"/>
-    <w:r>
-      <w:rPr>
-        <w:i/>
-        <w:iCs/>
-        <w:sz w:val="16"/>
-        <w:szCs w:val="20"/>
-      </w:rPr>
-      <w:t xml:space="preserve"> </w:t>
-    </w:r>
-    <w:proofErr w:type="spellStart"/>
-    <w:r>
-      <w:rPr>
-        <w:i/>
-        <w:iCs/>
-        <w:sz w:val="16"/>
-        <w:szCs w:val="20"/>
-      </w:rPr>
-      <w:t>dicetak</w:t>
-    </w:r>
-    <w:proofErr w:type="spellEnd"/>
-    <w:r>
-      <w:rPr>
-        <w:i/>
-        <w:iCs/>
-        <w:sz w:val="16"/>
-        <w:szCs w:val="20"/>
-      </w:rPr>
-      <w:t xml:space="preserve"> pada ${</w:t>
-    </w:r>
-    <w:r>
-      <w:rPr>
-        <w:i/>
-        <w:iCs/>
-        <w:sz w:val="16"/>
-        <w:szCs w:val="20"/>
-        <w:lang w:val="en-ID"/>
-      </w:rPr>
-      <w:t>TANGGAL_CETAK</w:t>
-    </w:r>
-    <w:r>
-      <w:rPr>
-        <w:i/>
-        <w:iCs/>
-        <w:sz w:val="16"/>
-        <w:szCs w:val="20"/>
-      </w:rPr>
-      <w:t>}</w:t>
+      <w:t>Rev. II/2026</w:t>
     </w:r>
   </w:p>
 </w:ftr>
 </file>
 
 <file path=word/footnotes.xml><?xml version="1.0" encoding="utf-8"?>
-<w:footnotes xmlns:wpc="http://schemas.microsoft.com/office/word/2010/wordprocessingCanvas" xmlns:cx="http://schemas.microsoft.com/office/drawing/2014/chartex" xmlns:cx1="http://schemas.microsoft.com/office/drawing/2015/9/8/chartex" xmlns:cx2="http://schemas.microsoft.com/office/drawing/2015/10/21/chartex" xmlns:cx3="http://schemas.microsoft.com/office/drawing/2016/5/9/chartex" xmlns:cx4="http://schemas.microsoft.com/office/drawing/2016/5/10/chartex" xmlns:cx5="http://schemas.microsoft.com/office/drawing/2016/5/11/chartex" xmlns:cx6="http://schemas.microsoft.com/office/drawing/2016/5/12/chartex" xmlns:cx7="http://schemas.microsoft.com/office/drawing/2016/5/13/chartex" xmlns:cx8="http://schemas.microsoft.com/office/drawing/2016/5/14/chartex" xmlns:mc="http://schemas.openxmlformats.org/markup-compatibility/2006" xmlns:aink="http://schemas.microsoft.com/office/drawing/2016/ink" xmlns:am3d="http://schemas.microsoft.com/office/drawing/2017/model3d" xmlns:o="urn:schemas-microsoft-com:office:office" xmlns:oel="http://schemas.microsoft.com/office/2019/extlst" xmlns:r="http://schemas.openxmlformats.org/officeDocument/2006/relationships" xmlns:m="http://schemas.openxmlformats.org/officeDocument/2006/math" xmlns:v="urn:schemas-microsoft-com:vml" xmlns:wp14="http://schemas.microsoft.com/office/word/2010/wordprocessingDrawing" xmlns:wp="http://schemas.openxmlformats.org/drawingml/2006/wordprocessingDrawing" xmlns:w10="urn:schemas-microsoft-com:office:word" xmlns:w="http://schemas.openxmlformats.org/wordprocessingml/2006/main" xmlns:w14="http://schemas.microsoft.com/office/word/2010/wordml" xmlns:w15="http://schemas.microsoft.com/office/word/2012/wordml" xmlns:w16cex="http://schemas.microsoft.com/office/word/2018/wordml/cex" xmlns:w16cid="http://schemas.microsoft.com/office/word/2016/wordml/cid" xmlns:w16="http://schemas.microsoft.com/office/word/2018/wordml" xmlns:w16sdtdh="http://schemas.microsoft.com/office/word/2020/wordml/sdtdatahash" xmlns:w16se="http://schemas.microsoft.com/office/word/2015/wordml/symex" xmlns:wpg="http://schemas.microsoft.com/office/word/2010/wordprocessingGroup" xmlns:wpi="http://schemas.microsoft.com/office/word/2010/wordprocessingInk" xmlns:wne="http://schemas.microsoft.com/office/word/2006/wordml" xmlns:wps="http://schemas.microsoft.com/office/word/2010/wordprocessingShape" mc:Ignorable="w14 w15 w16se w16cid w16 w16cex w16sdtdh wp14">
+<w:footnotes xmlns:wpc="http://schemas.microsoft.com/office/word/2010/wordprocessingCanvas" xmlns:cx="http://schemas.microsoft.com/office/drawing/2014/chartex" xmlns:cx1="http://schemas.microsoft.com/office/drawing/2015/9/8/chartex" xmlns:cx2="http://schemas.microsoft.com/office/drawing/2015/10/21/chartex" xmlns:cx3="http://schemas.microsoft.com/office/drawing/2016/5/9/chartex" xmlns:cx4="http://schemas.microsoft.com/office/drawing/2016/5/10/chartex" xmlns:cx5="http://schemas.microsoft.com/office/drawing/2016/5/11/chartex" xmlns:cx6="http://schemas.microsoft.com/office/drawing/2016/5/12/chartex" xmlns:cx7="http://schemas.microsoft.com/office/drawing/2016/5/13/chartex" xmlns:cx8="http://schemas.microsoft.com/office/drawing/2016/5/14/chartex" xmlns:mc="http://schemas.openxmlformats.org/markup-compatibility/2006" xmlns:aink="http://schemas.microsoft.com/office/drawing/2016/ink" xmlns:am3d="http://schemas.microsoft.com/office/drawing/2017/model3d" xmlns:o="urn:schemas-microsoft-com:office:office" xmlns:oel="http://schemas.microsoft.com/office/2019/extlst" xmlns:r="http://schemas.openxmlformats.org/officeDocument/2006/relationships" xmlns:m="http://schemas.openxmlformats.org/officeDocument/2006/math" xmlns:v="urn:schemas-microsoft-com:vml" xmlns:wp14="http://schemas.microsoft.com/office/word/2010/wordprocessingDrawing" xmlns:wp="http://schemas.openxmlformats.org/drawingml/2006/wordprocessingDrawing" xmlns:w10="urn:schemas-microsoft-com:office:word" xmlns:w="http://schemas.openxmlformats.org/wordprocessingml/2006/main" xmlns:w14="http://schemas.microsoft.com/office/word/2010/wordml" xmlns:w15="http://schemas.microsoft.com/office/word/2012/wordml" xmlns:w16cex="http://schemas.microsoft.com/office/word/2018/wordml/cex" xmlns:w16cid="http://schemas.microsoft.com/office/word/2016/wordml/cid" xmlns:w16="http://schemas.microsoft.com/office/word/2018/wordml" xmlns:w16du="http://schemas.microsoft.com/office/word/2023/wordml/word16du" xmlns:w16sdtdh="http://schemas.microsoft.com/office/word/2020/wordml/sdtdatahash" xmlns:w16sdtfl="http://schemas.microsoft.com/office/word/2024/wordml/sdtformatlock" xmlns:w16se="http://schemas.microsoft.com/office/word/2015/wordml/symex" xmlns:wpg="http://schemas.microsoft.com/office/word/2010/wordprocessingGroup" xmlns:wpi="http://schemas.microsoft.com/office/word/2010/wordprocessingInk" xmlns:wne="http://schemas.microsoft.com/office/word/2006/wordml" xmlns:wps="http://schemas.microsoft.com/office/word/2010/wordprocessingShape" mc:Ignorable="w14 w15 w16se w16cid w16 w16cex w16sdtdh w16sdtfl w16du wp14">
   <w:footnote w:type="separator" w:id="-1">
     <w:p>
       <w:pPr>
@@ -2802,7 +2718,7 @@
 </file>
 
 <file path=word/numbering.xml><?xml version="1.0" encoding="utf-8"?>
-<w:numbering xmlns:wpc="http://schemas.microsoft.com/office/word/2010/wordprocessingCanvas" xmlns:cx="http://schemas.microsoft.com/office/drawing/2014/chartex" xmlns:cx1="http://schemas.microsoft.com/office/drawing/2015/9/8/chartex" xmlns:cx2="http://schemas.microsoft.com/office/drawing/2015/10/21/chartex" xmlns:cx3="http://schemas.microsoft.com/office/drawing/2016/5/9/chartex" xmlns:cx4="http://schemas.microsoft.com/office/drawing/2016/5/10/chartex" xmlns:cx5="http://schemas.microsoft.com/office/drawing/2016/5/11/chartex" xmlns:cx6="http://schemas.microsoft.com/office/drawing/2016/5/12/chartex" xmlns:cx7="http://schemas.microsoft.com/office/drawing/2016/5/13/chartex" xmlns:cx8="http://schemas.microsoft.com/office/drawing/2016/5/14/chartex" xmlns:mc="http://schemas.openxmlformats.org/markup-compatibility/2006" xmlns:aink="http://schemas.microsoft.com/office/drawing/2016/ink" xmlns:am3d="http://schemas.microsoft.com/office/drawing/2017/model3d" xmlns:o="urn:schemas-microsoft-com:office:office" xmlns:oel="http://schemas.microsoft.com/office/2019/extlst" xmlns:r="http://schemas.openxmlformats.org/officeDocument/2006/relationships" xmlns:m="http://schemas.openxmlformats.org/officeDocument/2006/math" xmlns:v="urn:schemas-microsoft-com:vml" xmlns:wp14="http://schemas.microsoft.com/office/word/2010/wordprocessingDrawing" xmlns:wp="http://schemas.openxmlformats.org/drawingml/2006/wordprocessingDrawing" xmlns:w10="urn:schemas-microsoft-com:office:word" xmlns:w="http://schemas.openxmlformats.org/wordprocessingml/2006/main" xmlns:w14="http://schemas.microsoft.com/office/word/2010/wordml" xmlns:w15="http://schemas.microsoft.com/office/word/2012/wordml" xmlns:w16cex="http://schemas.microsoft.com/office/word/2018/wordml/cex" xmlns:w16cid="http://schemas.microsoft.com/office/word/2016/wordml/cid" xmlns:w16="http://schemas.microsoft.com/office/word/2018/wordml" xmlns:w16sdtdh="http://schemas.microsoft.com/office/word/2020/wordml/sdtdatahash" xmlns:w16se="http://schemas.microsoft.com/office/word/2015/wordml/symex" xmlns:wpg="http://schemas.microsoft.com/office/word/2010/wordprocessingGroup" xmlns:wpi="http://schemas.microsoft.com/office/word/2010/wordprocessingInk" xmlns:wne="http://schemas.microsoft.com/office/word/2006/wordml" xmlns:wps="http://schemas.microsoft.com/office/word/2010/wordprocessingShape" mc:Ignorable="w14 w15 w16se w16cid w16 w16cex w16sdtdh wp14">
+<w:numbering xmlns:wpc="http://schemas.microsoft.com/office/word/2010/wordprocessingCanvas" xmlns:cx="http://schemas.microsoft.com/office/drawing/2014/chartex" xmlns:cx1="http://schemas.microsoft.com/office/drawing/2015/9/8/chartex" xmlns:cx2="http://schemas.microsoft.com/office/drawing/2015/10/21/chartex" xmlns:cx3="http://schemas.microsoft.com/office/drawing/2016/5/9/chartex" xmlns:cx4="http://schemas.microsoft.com/office/drawing/2016/5/10/chartex" xmlns:cx5="http://schemas.microsoft.com/office/drawing/2016/5/11/chartex" xmlns:cx6="http://schemas.microsoft.com/office/drawing/2016/5/12/chartex" xmlns:cx7="http://schemas.microsoft.com/office/drawing/2016/5/13/chartex" xmlns:cx8="http://schemas.microsoft.com/office/drawing/2016/5/14/chartex" xmlns:mc="http://schemas.openxmlformats.org/markup-compatibility/2006" xmlns:aink="http://schemas.microsoft.com/office/drawing/2016/ink" xmlns:am3d="http://schemas.microsoft.com/office/drawing/2017/model3d" xmlns:o="urn:schemas-microsoft-com:office:office" xmlns:oel="http://schemas.microsoft.com/office/2019/extlst" xmlns:r="http://schemas.openxmlformats.org/officeDocument/2006/relationships" xmlns:m="http://schemas.openxmlformats.org/officeDocument/2006/math" xmlns:v="urn:schemas-microsoft-com:vml" xmlns:wp14="http://schemas.microsoft.com/office/word/2010/wordprocessingDrawing" xmlns:wp="http://schemas.openxmlformats.org/drawingml/2006/wordprocessingDrawing" xmlns:w10="urn:schemas-microsoft-com:office:word" xmlns:w="http://schemas.openxmlformats.org/wordprocessingml/2006/main" xmlns:w14="http://schemas.microsoft.com/office/word/2010/wordml" xmlns:w15="http://schemas.microsoft.com/office/word/2012/wordml" xmlns:w16cex="http://schemas.microsoft.com/office/word/2018/wordml/cex" xmlns:w16cid="http://schemas.microsoft.com/office/word/2016/wordml/cid" xmlns:w16="http://schemas.microsoft.com/office/word/2018/wordml" xmlns:w16du="http://schemas.microsoft.com/office/word/2023/wordml/word16du" xmlns:w16sdtdh="http://schemas.microsoft.com/office/word/2020/wordml/sdtdatahash" xmlns:w16sdtfl="http://schemas.microsoft.com/office/word/2024/wordml/sdtformatlock" xmlns:w16se="http://schemas.microsoft.com/office/word/2015/wordml/symex" xmlns:wpg="http://schemas.microsoft.com/office/word/2010/wordprocessingGroup" xmlns:wpi="http://schemas.microsoft.com/office/word/2010/wordprocessingInk" xmlns:wne="http://schemas.microsoft.com/office/word/2006/wordml" xmlns:wps="http://schemas.microsoft.com/office/word/2010/wordprocessingShape" mc:Ignorable="w14 w15 w16se w16cid w16 w16cex w16sdtdh w16sdtfl w16du wp14">
   <w:abstractNum w:abstractNumId="0" w15:restartNumberingAfterBreak="0">
     <w:nsid w:val="FFFFFF7C"/>
     <w:multiLevelType w:val="singleLevel"/>
@@ -3005,7 +2921,7 @@
 </file>
 
 <file path=word/styles.xml><?xml version="1.0" encoding="utf-8"?>
-<w:styles xmlns:mc="http://schemas.openxmlformats.org/markup-compatibility/2006" xmlns:r="http://schemas.openxmlformats.org/officeDocument/2006/relationships" xmlns:w="http://schemas.openxmlformats.org/wordprocessingml/2006/main" xmlns:w14="http://schemas.microsoft.com/office/word/2010/wordml" xmlns:w15="http://schemas.microsoft.com/office/word/2012/wordml" xmlns:w16cex="http://schemas.microsoft.com/office/word/2018/wordml/cex" xmlns:w16cid="http://schemas.microsoft.com/office/word/2016/wordml/cid" xmlns:w16="http://schemas.microsoft.com/office/word/2018/wordml" xmlns:w16sdtdh="http://schemas.microsoft.com/office/word/2020/wordml/sdtdatahash" xmlns:w16se="http://schemas.microsoft.com/office/word/2015/wordml/symex" mc:Ignorable="w14 w15 w16se w16cid w16 w16cex w16sdtdh">
+<w:styles xmlns:mc="http://schemas.openxmlformats.org/markup-compatibility/2006" xmlns:r="http://schemas.openxmlformats.org/officeDocument/2006/relationships" xmlns:w="http://schemas.openxmlformats.org/wordprocessingml/2006/main" xmlns:w14="http://schemas.microsoft.com/office/word/2010/wordml" xmlns:w15="http://schemas.microsoft.com/office/word/2012/wordml" xmlns:w16cex="http://schemas.microsoft.com/office/word/2018/wordml/cex" xmlns:w16cid="http://schemas.microsoft.com/office/word/2016/wordml/cid" xmlns:w16="http://schemas.microsoft.com/office/word/2018/wordml" xmlns:w16du="http://schemas.microsoft.com/office/word/2023/wordml/word16du" xmlns:w16sdtdh="http://schemas.microsoft.com/office/word/2020/wordml/sdtdatahash" xmlns:w16sdtfl="http://schemas.microsoft.com/office/word/2024/wordml/sdtformatlock" xmlns:w16se="http://schemas.microsoft.com/office/word/2015/wordml/symex" mc:Ignorable="w14 w15 w16se w16cid w16 w16cex w16sdtdh w16sdtfl w16du">
   <w:docDefaults>
     <w:rPrDefault>
       <w:rPr>

</xml_diff>